<commit_message>
fix: org/project activity workspace enrichment - ActivityDto WorkspaceId + Board/Sprint/SubTask/Comment/Project logs pass WorkspaceId, OrgActivityService COALESCE LEFT JOIN + fallback WsMap, project-activity 6 cols workspace badge, paginator 10 - build 0 errors
</commit_message>
<xml_diff>
--- a/Documents/FlowBoard_Tasks_Plan.docx
+++ b/Documents/FlowBoard_Tasks_Plan.docx
@@ -37,12 +37,7 @@
         <w:jc w:val="center"/>
       </w:pPr>
       <w:r>
-        <w:rPr>
-          <w:rFonts w:ascii="Calibri" w:hAnsi="Calibri"/>
-          <w:color w:val="595959"/>
-          <w:sz w:val="18"/>
-        </w:rPr>
-        <w:t>From Setup to Production  •  6 Phases  •  26 Tasks  •  One Task at a Time</w:t>
+        <w:t>From Setup to Production  •  7 Phases  •  38 Tasks  •  One Task at a Time</w:t>
       </w:r>
     </w:p>
     <w:p/>
@@ -311,17 +306,7 @@
         <w:spacing w:after="20"/>
       </w:pPr>
       <w:r>
-        <w:rPr>
-          <w:rFonts w:ascii="Calibri" w:hAnsi="Calibri"/>
-          <w:color w:val="1F3864"/>
-          <w:sz w:val="17"/>
-        </w:rPr>
-        <w:t>2.   Phase Overview (6 Phases, 26 Tasks, ~85 Hours)</w:t>
-      </w:r>
-      <w:r>
-        <w:rPr>
-          <w:sz w:val="17"/>
-        </w:rPr>
+        <w:t>2.   Phase Overview (7 Phases, 38 Tasks, ~99 Hours)</w:t>
         <w:tab/>
         <w:t>3</w:t>
       </w:r>
@@ -1040,13 +1025,7 @@
         <w:spacing w:before="144" w:after="72"/>
       </w:pPr>
       <w:r>
-        <w:rPr>
-          <w:rFonts w:ascii="Calibri" w:hAnsi="Calibri"/>
-          <w:b/>
-          <w:color w:val="1F3864"/>
-          <w:sz w:val="32"/>
-        </w:rPr>
-        <w:t>2. Phase Overview (6 Phases, 26 Tasks, ~85 Hours)</w:t>
+        <w:t>2. Phase Overview (7 Phases, 38 Tasks, ~99 Hours)</w:t>
       </w:r>
     </w:p>
     <w:tbl>
@@ -1603,18 +1582,8 @@
             <w:vAlign w:val="center"/>
           </w:tcPr>
           <w:p>
-            <w:pPr>
-              <w:jc w:val="left"/>
-            </w:pPr>
-            <w:r/>
-            <w:r>
-              <w:rPr>
-                <w:rFonts w:ascii="Calibri" w:hAnsi="Calibri"/>
-                <w:b/>
-                <w:color w:val="333333"/>
-                <w:sz w:val="13"/>
-              </w:rPr>
-              <w:t>4: Files, AI &amp; Charts</w:t>
+            <w:r>
+              <w:t>4: Files &amp; Charts</w:t>
             </w:r>
           </w:p>
         </w:tc>
@@ -1624,17 +1593,8 @@
             <w:vAlign w:val="center"/>
           </w:tcPr>
           <w:p>
-            <w:pPr>
-              <w:jc w:val="left"/>
-            </w:pPr>
-            <w:r/>
-            <w:r>
-              <w:rPr>
-                <w:rFonts w:ascii="Calibri" w:hAnsi="Calibri"/>
-                <w:color w:val="333333"/>
-                <w:sz w:val="13"/>
-              </w:rPr>
-              <w:t>4.1 - 4.4 (4 tasks)</w:t>
+            <w:r>
+              <w:t>4.1 - 4.3 (3 tasks)</w:t>
             </w:r>
           </w:p>
         </w:tc>
@@ -1644,17 +1604,8 @@
             <w:vAlign w:val="center"/>
           </w:tcPr>
           <w:p>
-            <w:pPr>
-              <w:jc w:val="left"/>
-            </w:pPr>
-            <w:r/>
-            <w:r>
-              <w:rPr>
-                <w:rFonts w:ascii="Calibri" w:hAnsi="Calibri"/>
-                <w:color w:val="333333"/>
-                <w:sz w:val="13"/>
-              </w:rPr>
-              <w:t>Cloudinary, Gemini 2.5 Flash, ng-apexcharts, Brevo notifications</w:t>
+            <w:r>
+              <w:t>Cloudinary, Attachments, ApexCharts</w:t>
             </w:r>
           </w:p>
         </w:tc>
@@ -1664,17 +1615,8 @@
             <w:vAlign w:val="center"/>
           </w:tcPr>
           <w:p>
-            <w:pPr>
-              <w:jc w:val="left"/>
-            </w:pPr>
-            <w:r/>
-            <w:r>
-              <w:rPr>
-                <w:rFonts w:ascii="Calibri" w:hAnsi="Calibri"/>
-                <w:color w:val="333333"/>
-                <w:sz w:val="13"/>
-              </w:rPr>
-              <w:t>10h</w:t>
+            <w:r>
+              <w:t>7h</w:t>
             </w:r>
           </w:p>
         </w:tc>
@@ -1706,18 +1648,8 @@
             <w:vAlign w:val="center"/>
           </w:tcPr>
           <w:p>
-            <w:pPr>
-              <w:jc w:val="left"/>
-            </w:pPr>
-            <w:r/>
-            <w:r>
-              <w:rPr>
-                <w:rFonts w:ascii="Calibri" w:hAnsi="Calibri"/>
-                <w:b/>
-                <w:color w:val="333333"/>
-                <w:sz w:val="13"/>
-              </w:rPr>
-              <w:t>5: Polish &amp; Prod Deploy</w:t>
+            <w:r>
+              <w:t>7: AI Intelligence (Gemini + Groq)</w:t>
             </w:r>
           </w:p>
         </w:tc>
@@ -1727,17 +1659,8 @@
             <w:vAlign w:val="center"/>
           </w:tcPr>
           <w:p>
-            <w:pPr>
-              <w:jc w:val="left"/>
-            </w:pPr>
-            <w:r/>
-            <w:r>
-              <w:rPr>
-                <w:rFonts w:ascii="Calibri" w:hAnsi="Calibri"/>
-                <w:color w:val="333333"/>
-                <w:sz w:val="13"/>
-              </w:rPr>
-              <w:t>5.1 - 5.4 (4 tasks)</w:t>
+            <w:r>
+              <w:t>7.1 - 7.7 (7 tasks)</w:t>
             </w:r>
           </w:p>
         </w:tc>
@@ -1747,17 +1670,8 @@
             <w:vAlign w:val="center"/>
           </w:tcPr>
           <w:p>
-            <w:pPr>
-              <w:jc w:val="left"/>
-            </w:pPr>
-            <w:r/>
-            <w:r>
-              <w:rPr>
-                <w:rFonts w:ascii="Calibri" w:hAnsi="Calibri"/>
-                <w:color w:val="333333"/>
-                <w:sz w:val="13"/>
-              </w:rPr>
-              <w:t>Rate limit, Serilog, tests 70%, README/Postman, MonsterASP.net + Vercel</w:t>
+            <w:r>
+              <w:t>Draft/Enhance/Criteria/Breakdown/AiLogs Org/Project</w:t>
             </w:r>
           </w:p>
         </w:tc>
@@ -1767,17 +1681,8 @@
             <w:vAlign w:val="center"/>
           </w:tcPr>
           <w:p>
-            <w:pPr>
-              <w:jc w:val="left"/>
-            </w:pPr>
-            <w:r/>
-            <w:r>
-              <w:rPr>
-                <w:rFonts w:ascii="Calibri" w:hAnsi="Calibri"/>
-                <w:color w:val="333333"/>
-                <w:sz w:val="13"/>
-              </w:rPr>
-              <w:t>13h</w:t>
+            <w:r>
+              <w:t>17h</w:t>
             </w:r>
           </w:p>
         </w:tc>
@@ -1787,17 +1692,8 @@
             <w:vAlign w:val="center"/>
           </w:tcPr>
           <w:p>
-            <w:pPr>
-              <w:jc w:val="left"/>
-            </w:pPr>
-            <w:r/>
-            <w:r>
-              <w:rPr>
-                <w:rFonts w:ascii="Calibri" w:hAnsi="Calibri"/>
-                <w:color w:val="333333"/>
-                <w:sz w:val="13"/>
-              </w:rPr>
-              <w:t>Production</w:t>
+            <w:r>
+              <w:t>Local</w:t>
             </w:r>
           </w:p>
         </w:tc>
@@ -1809,18 +1705,8 @@
             <w:vAlign w:val="center"/>
           </w:tcPr>
           <w:p>
-            <w:pPr>
-              <w:jc w:val="left"/>
-            </w:pPr>
-            <w:r/>
-            <w:r>
-              <w:rPr>
-                <w:rFonts w:ascii="Calibri" w:hAnsi="Calibri"/>
-                <w:b/>
-                <w:color w:val="333333"/>
-                <w:sz w:val="13"/>
-              </w:rPr>
-              <w:t>Total</w:t>
+            <w:r>
+              <w:t>5: Polish &amp; Prod Deploy</w:t>
             </w:r>
           </w:p>
         </w:tc>
@@ -1830,17 +1716,8 @@
             <w:vAlign w:val="center"/>
           </w:tcPr>
           <w:p>
-            <w:pPr>
-              <w:jc w:val="left"/>
-            </w:pPr>
-            <w:r/>
-            <w:r>
-              <w:rPr>
-                <w:rFonts w:ascii="Calibri" w:hAnsi="Calibri"/>
-                <w:color w:val="333333"/>
-                <w:sz w:val="13"/>
-              </w:rPr>
-              <w:t>26 Tasks</w:t>
+            <w:r>
+              <w:t>5.1 - 5.4 (4 tasks)</w:t>
             </w:r>
           </w:p>
         </w:tc>
@@ -1850,16 +1727,8 @@
             <w:vAlign w:val="center"/>
           </w:tcPr>
           <w:p>
-            <w:pPr>
-              <w:jc w:val="left"/>
-            </w:pPr>
-            <w:r/>
-            <w:r>
-              <w:rPr>
-                <w:rFonts w:ascii="Calibri" w:hAnsi="Calibri"/>
-                <w:color w:val="333333"/>
-                <w:sz w:val="13"/>
-              </w:rPr>
+            <w:r>
+              <w:t>Rate limit, Serilog, tests 70%, README/Postman, MonsterASP.net + Vercel</w:t>
             </w:r>
           </w:p>
         </w:tc>
@@ -1869,17 +1738,8 @@
             <w:vAlign w:val="center"/>
           </w:tcPr>
           <w:p>
-            <w:pPr>
-              <w:jc w:val="left"/>
-            </w:pPr>
-            <w:r/>
-            <w:r>
-              <w:rPr>
-                <w:rFonts w:ascii="Calibri" w:hAnsi="Calibri"/>
-                <w:color w:val="333333"/>
-                <w:sz w:val="13"/>
-              </w:rPr>
-              <w:t>~85h</w:t>
+            <w:r>
+              <w:t>13h</w:t>
             </w:r>
           </w:p>
         </w:tc>
@@ -1889,16 +1749,57 @@
             <w:vAlign w:val="center"/>
           </w:tcPr>
           <w:p>
-            <w:pPr>
-              <w:jc w:val="left"/>
-            </w:pPr>
+            <w:r>
+              <w:t>Production</w:t>
+            </w:r>
+          </w:p>
+        </w:tc>
+      </w:tr>
+      <w:tr>
+        <w:tc>
+          <w:tcPr>
+            <w:tcW w:type="dxa" w:w="1700"/>
+          </w:tcPr>
+          <w:p>
+            <w:r>
+              <w:t>Total</w:t>
+            </w:r>
+          </w:p>
+        </w:tc>
+        <w:tc>
+          <w:tcPr>
+            <w:tcW w:type="dxa" w:w="1700"/>
+          </w:tcPr>
+          <w:p>
+            <w:r>
+              <w:t>38 Tasks</w:t>
+            </w:r>
+          </w:p>
+        </w:tc>
+        <w:tc>
+          <w:tcPr>
+            <w:tcW w:type="dxa" w:w="1700"/>
+          </w:tcPr>
+          <w:p>
             <w:r/>
-            <w:r>
-              <w:rPr>
-                <w:rFonts w:ascii="Calibri" w:hAnsi="Calibri"/>
-                <w:color w:val="333333"/>
-                <w:sz w:val="13"/>
-              </w:rPr>
+          </w:p>
+        </w:tc>
+        <w:tc>
+          <w:tcPr>
+            <w:tcW w:type="dxa" w:w="1700"/>
+          </w:tcPr>
+          <w:p>
+            <w:r>
+              <w:t>~99h</w:t>
+            </w:r>
+          </w:p>
+        </w:tc>
+        <w:tc>
+          <w:tcPr>
+            <w:tcW w:type="dxa" w:w="1700"/>
+          </w:tcPr>
+          <w:p>
+            <w:r>
               <w:t>Local -&gt; Prod</w:t>
             </w:r>
           </w:p>
@@ -15731,13 +15632,7 @@
         <w:jc w:val="center"/>
       </w:pPr>
       <w:r>
-        <w:rPr>
-          <w:rFonts w:ascii="Calibri" w:hAnsi="Calibri"/>
-          <w:b/>
-          <w:color w:val="1F3864"/>
-          <w:sz w:val="16"/>
-        </w:rPr>
-        <w:t>— End of Tasks Plan v1.0 —  26 Tasks  •  6 Phases  •  One Task at a Time  •  Next: Task 0.1 Git Init —</w:t>
+        <w:t>— End of Tasks Plan v1.0 —  38 Tasks  •  7 Phases  •  One Task at a Time  •  Next: Task 0.1 Git Init —</w:t>
       </w:r>
     </w:p>
     <w:p>
@@ -16511,6 +16406,806 @@
         </w:tc>
       </w:tr>
     </w:tbl>
+    <w:p>
+      <w:pPr>
+        <w:pStyle w:val="Heading1"/>
+      </w:pPr>
+      <w:r>
+        <w:t>Phase 7: AI Intelligence (Gemini + Groq - A/B/C/D) - 6 Tasks (14 Hours)</w:t>
+      </w:r>
+    </w:p>
+    <w:p>
+      <w:r>
+        <w:t>Goal: Add MNC-grade AI draft/enhance/criteria/breakdown with human-in-the-loop, user-selected provider (Gemini 2.5 Flash fixed + Groq llama-3.1-8b free), Redis 3/min per user (5 RPM total), AiUsageLogs analytics, separate AI folder in Project.Service (not new microservice).</w:t>
+      </w:r>
+    </w:p>
+    <w:tbl>
+      <w:tblPr>
+        <w:tblStyle w:val="LightGrid-Accent1"/>
+        <w:tblW w:type="auto" w:w="0"/>
+        <w:tblLook w:firstColumn="1" w:firstRow="1" w:lastColumn="0" w:lastRow="0" w:noHBand="0" w:noVBand="1" w:val="04A0"/>
+      </w:tblPr>
+      <w:tblGrid>
+        <w:gridCol w:w="1560"/>
+        <w:gridCol w:w="1560"/>
+        <w:gridCol w:w="1560"/>
+        <w:gridCol w:w="1560"/>
+        <w:gridCol w:w="1560"/>
+        <w:gridCol w:w="1560"/>
+      </w:tblGrid>
+      <w:tr>
+        <w:tc>
+          <w:tcPr>
+            <w:tcW w:type="dxa" w:w="1560"/>
+          </w:tcPr>
+          <w:p>
+            <w:r>
+              <w:t>Task</w:t>
+            </w:r>
+          </w:p>
+        </w:tc>
+        <w:tc>
+          <w:tcPr>
+            <w:tcW w:type="dxa" w:w="1560"/>
+          </w:tcPr>
+          <w:p>
+            <w:r>
+              <w:t>Objective</w:t>
+            </w:r>
+          </w:p>
+        </w:tc>
+        <w:tc>
+          <w:tcPr>
+            <w:tcW w:type="dxa" w:w="1560"/>
+          </w:tcPr>
+          <w:p>
+            <w:r>
+              <w:t>Key Actions</w:t>
+            </w:r>
+          </w:p>
+        </w:tc>
+        <w:tc>
+          <w:tcPr>
+            <w:tcW w:type="dxa" w:w="1560"/>
+          </w:tcPr>
+          <w:p>
+            <w:r>
+              <w:t>Deliverables</w:t>
+            </w:r>
+          </w:p>
+        </w:tc>
+        <w:tc>
+          <w:tcPr>
+            <w:tcW w:type="dxa" w:w="1560"/>
+          </w:tcPr>
+          <w:p>
+            <w:r>
+              <w:t>Exit Criteria</w:t>
+            </w:r>
+          </w:p>
+        </w:tc>
+        <w:tc>
+          <w:tcPr>
+            <w:tcW w:type="dxa" w:w="1560"/>
+          </w:tcPr>
+          <w:p>
+            <w:r>
+              <w:t>Hours</w:t>
+            </w:r>
+          </w:p>
+        </w:tc>
+      </w:tr>
+      <w:tr>
+        <w:tc>
+          <w:tcPr>
+            <w:tcW w:type="dxa" w:w="1560"/>
+          </w:tcPr>
+          <w:p>
+            <w:r>
+              <w:t>7.1 AI Infra + AiLogs</w:t>
+            </w:r>
+          </w:p>
+        </w:tc>
+        <w:tc>
+          <w:tcPr>
+            <w:tcW w:type="dxa" w:w="1560"/>
+          </w:tcPr>
+          <w:p>
+            <w:r>
+              <w:t>AI module + AiUsageLogs + providers + Redis 3/min</w:t>
+            </w:r>
+          </w:p>
+        </w:tc>
+        <w:tc>
+          <w:tcPr>
+            <w:tcW w:type="dxa" w:w="1560"/>
+          </w:tcPr>
+          <w:p>
+            <w:r>
+              <w:t>Create Application/AI + Infrastructure/AI, AiUsageLog entity, DbSet, Migration AddAiLogs, AddScoped IAiService/IGeminiProvider/IGroqProvider, HttpClient, Redis</w:t>
+            </w:r>
+          </w:p>
+        </w:tc>
+        <w:tc>
+          <w:tcPr>
+            <w:tcW w:type="dxa" w:w="1560"/>
+          </w:tcPr>
+          <w:p>
+            <w:r>
+              <w:t>AI module, AiUsageLogs migration, Providers</w:t>
+            </w:r>
+          </w:p>
+        </w:tc>
+        <w:tc>
+          <w:tcPr>
+            <w:tcW w:type="dxa" w:w="1560"/>
+          </w:tcPr>
+          <w:p>
+            <w:r>
+              <w:t>dotnet ef AddAiLogs + build 0W, 3rd call 429</w:t>
+            </w:r>
+          </w:p>
+        </w:tc>
+        <w:tc>
+          <w:tcPr>
+            <w:tcW w:type="dxa" w:w="1560"/>
+          </w:tcPr>
+          <w:p>
+            <w:r>
+              <w:t>3h</w:t>
+            </w:r>
+          </w:p>
+        </w:tc>
+      </w:tr>
+      <w:tr>
+        <w:tc>
+          <w:tcPr>
+            <w:tcW w:type="dxa" w:w="1560"/>
+          </w:tcPr>
+          <w:p>
+            <w:r>
+              <w:t>7.2 AI Draft (A)</w:t>
+            </w:r>
+          </w:p>
+        </w:tc>
+        <w:tc>
+          <w:tcPr>
+            <w:tcW w:type="dxa" w:w="1560"/>
+          </w:tcPr>
+          <w:p>
+            <w:r>
+              <w:t>Draft via prompt temp detail modal without save</w:t>
+            </w:r>
+          </w:p>
+        </w:tc>
+        <w:tc>
+          <w:tcPr>
+            <w:tcW w:type="dxa" w:w="1560"/>
+          </w:tcPr>
+          <w:p>
+            <w:r>
+              <w:t>Issues header AI Draft btn modal prompt POST ai/draft Gemini/Groq JSON title/description/checklist/labels -&gt; preview editable -&gt; Create POST tasks</w:t>
+            </w:r>
+          </w:p>
+        </w:tc>
+        <w:tc>
+          <w:tcPr>
+            <w:tcW w:type="dxa" w:w="1560"/>
+          </w:tcPr>
+          <w:p>
+            <w:r>
+              <w:t>AI Draft modal + endpoint</w:t>
+            </w:r>
+          </w:p>
+        </w:tc>
+        <w:tc>
+          <w:tcPr>
+            <w:tcW w:type="dxa" w:w="1560"/>
+          </w:tcPr>
+          <w:p>
+            <w:r>
+              <w:t>Prompt Users 401 mobile -&gt; draft -&gt; 201</w:t>
+            </w:r>
+          </w:p>
+        </w:tc>
+        <w:tc>
+          <w:tcPr>
+            <w:tcW w:type="dxa" w:w="1560"/>
+          </w:tcPr>
+          <w:p>
+            <w:r>
+              <w:t>2.5h</w:t>
+            </w:r>
+          </w:p>
+        </w:tc>
+      </w:tr>
+      <w:tr>
+        <w:tc>
+          <w:tcPr>
+            <w:tcW w:type="dxa" w:w="1560"/>
+          </w:tcPr>
+          <w:p>
+            <w:r>
+              <w:t>7.3 AI Enhance (B)</w:t>
+            </w:r>
+          </w:p>
+        </w:tc>
+        <w:tc>
+          <w:tcPr>
+            <w:tcW w:type="dxa" w:w="1560"/>
+          </w:tcPr>
+          <w:p>
+            <w:r>
+              <w:t>Enhance existing issue in detail modal</w:t>
+            </w:r>
+          </w:p>
+        </w:tc>
+        <w:tc>
+          <w:tcPr>
+            <w:tcW w:type="dxa" w:w="1560"/>
+          </w:tcPr>
+          <w:p>
+            <w:r>
+              <w:t>Description Enhance btn POST ai-enhance with title+description -&gt; diff Current vs AI Apply sets signal pending until Save PUT</w:t>
+            </w:r>
+          </w:p>
+        </w:tc>
+        <w:tc>
+          <w:tcPr>
+            <w:tcW w:type="dxa" w:w="1560"/>
+          </w:tcPr>
+          <w:p>
+            <w:r>
+              <w:t>Enhance diff + Apply</w:t>
+            </w:r>
+          </w:p>
+        </w:tc>
+        <w:tc>
+          <w:tcPr>
+            <w:tcW w:type="dxa" w:w="1560"/>
+          </w:tcPr>
+          <w:p>
+            <w:r>
+              <w:t>Login broken -&gt; AI returns Investigate Apply Save 200</w:t>
+            </w:r>
+          </w:p>
+        </w:tc>
+        <w:tc>
+          <w:tcPr>
+            <w:tcW w:type="dxa" w:w="1560"/>
+          </w:tcPr>
+          <w:p>
+            <w:r>
+              <w:t>2h</w:t>
+            </w:r>
+          </w:p>
+        </w:tc>
+      </w:tr>
+      <w:tr>
+        <w:tc>
+          <w:tcPr>
+            <w:tcW w:type="dxa" w:w="1560"/>
+          </w:tcPr>
+          <w:p>
+            <w:r>
+              <w:t>7.4 AI Criteria (C)</w:t>
+            </w:r>
+          </w:p>
+        </w:tc>
+        <w:tc>
+          <w:tcPr>
+            <w:tcW w:type="dxa" w:w="1560"/>
+          </w:tcPr>
+          <w:p>
+            <w:r>
+              <w:t>Generate AC optional manual</w:t>
+            </w:r>
+          </w:p>
+        </w:tc>
+        <w:tc>
+          <w:tcPr>
+            <w:tcW w:type="dxa" w:w="1560"/>
+          </w:tcPr>
+          <w:p>
+            <w:r>
+              <w:t>Acceptance card under Description manual Add + Generate POST ai-criteria -&gt; checkbox list editable Apply sets signal Save PUT</w:t>
+            </w:r>
+          </w:p>
+        </w:tc>
+        <w:tc>
+          <w:tcPr>
+            <w:tcW w:type="dxa" w:w="1560"/>
+          </w:tcPr>
+          <w:p>
+            <w:r>
+              <w:t>Acceptance card + AI</w:t>
+            </w:r>
+          </w:p>
+        </w:tc>
+        <w:tc>
+          <w:tcPr>
+            <w:tcW w:type="dxa" w:w="1560"/>
+          </w:tcPr>
+          <w:p>
+            <w:r>
+              <w:t>Password reset -&gt; 6 ACs, Save without AI also works</w:t>
+            </w:r>
+          </w:p>
+        </w:tc>
+        <w:tc>
+          <w:tcPr>
+            <w:tcW w:type="dxa" w:w="1560"/>
+          </w:tcPr>
+          <w:p>
+            <w:r>
+              <w:t>2.5h</w:t>
+            </w:r>
+          </w:p>
+        </w:tc>
+      </w:tr>
+      <w:tr>
+        <w:tc>
+          <w:tcPr>
+            <w:tcW w:type="dxa" w:w="1560"/>
+          </w:tcPr>
+          <w:p>
+            <w:r>
+              <w:t>7.5 AI Breakdown (D)</w:t>
+            </w:r>
+          </w:p>
+        </w:tc>
+        <w:tc>
+          <w:tcPr>
+            <w:tcW w:type="dxa" w:w="1560"/>
+          </w:tcPr>
+          <w:p>
+            <w:r>
+              <w:t>Convert large issue to subtasks save-only on AI</w:t>
+            </w:r>
+          </w:p>
+        </w:tc>
+        <w:tc>
+          <w:tcPr>
+            <w:tcW w:type="dxa" w:w="1560"/>
+          </w:tcPr>
+          <w:p>
+            <w:r>
+              <w:t>Subtasks card Breakdown btn POST ai-breakdown -&gt; subtasks list checkbox editable Create Selected pending until Save PUT + POST subtasks batch</w:t>
+            </w:r>
+          </w:p>
+        </w:tc>
+        <w:tc>
+          <w:tcPr>
+            <w:tcW w:type="dxa" w:w="1560"/>
+          </w:tcPr>
+          <w:p>
+            <w:r>
+              <w:t>Breakdown pending</w:t>
+            </w:r>
+          </w:p>
+        </w:tc>
+        <w:tc>
+          <w:tcPr>
+            <w:tcW w:type="dxa" w:w="1560"/>
+          </w:tcPr>
+          <w:p>
+            <w:r>
+              <w:t>Build OAuth2 -&gt; 6 subtasks Save -&gt; 201</w:t>
+            </w:r>
+          </w:p>
+        </w:tc>
+        <w:tc>
+          <w:tcPr>
+            <w:tcW w:type="dxa" w:w="1560"/>
+          </w:tcPr>
+          <w:p>
+            <w:r>
+              <w:t>2.5h</w:t>
+            </w:r>
+          </w:p>
+        </w:tc>
+      </w:tr>
+      <w:tr>
+        <w:tc>
+          <w:tcPr>
+            <w:tcW w:type="dxa" w:w="1560"/>
+          </w:tcPr>
+          <w:p>
+            <w:r>
+              <w:t>7.6 AI Usage - Org Sidebar</w:t>
+            </w:r>
+          </w:p>
+        </w:tc>
+        <w:tc>
+          <w:tcPr>
+            <w:tcW w:type="dxa" w:w="1560"/>
+          </w:tcPr>
+          <w:p>
+            <w:r>
+              <w:t>Org AI Usage logs page</w:t>
+            </w:r>
+          </w:p>
+        </w:tc>
+        <w:tc>
+          <w:tcPr>
+            <w:tcW w:type="dxa" w:w="1560"/>
+          </w:tcPr>
+          <w:p>
+            <w:r>
+              <w:t>Main sidebar AI Usage org-level OrgAdmin only GET ai/usage?orgId GROUP BY tokens cost model selector</w:t>
+            </w:r>
+          </w:p>
+        </w:tc>
+        <w:tc>
+          <w:tcPr>
+            <w:tcW w:type="dxa" w:w="1560"/>
+          </w:tcPr>
+          <w:p>
+            <w:r>
+              <w:t>Org AI page</w:t>
+            </w:r>
+          </w:p>
+        </w:tc>
+        <w:tc>
+          <w:tcPr>
+            <w:tcW w:type="dxa" w:w="1560"/>
+          </w:tcPr>
+          <w:p>
+            <w:r>
+              <w:t>GET ai/usage org 200</w:t>
+            </w:r>
+          </w:p>
+        </w:tc>
+        <w:tc>
+          <w:tcPr>
+            <w:tcW w:type="dxa" w:w="1560"/>
+          </w:tcPr>
+          <w:p>
+            <w:r>
+              <w:t>1.5h</w:t>
+            </w:r>
+          </w:p>
+        </w:tc>
+      </w:tr>
+      <w:tr>
+        <w:tc>
+          <w:tcPr>
+            <w:tcW w:type="dxa" w:w="1560"/>
+          </w:tcPr>
+          <w:p>
+            <w:r>
+              <w:t>7.7 AI Usage - Project Sidebar</w:t>
+            </w:r>
+          </w:p>
+        </w:tc>
+        <w:tc>
+          <w:tcPr>
+            <w:tcW w:type="dxa" w:w="1560"/>
+          </w:tcPr>
+          <w:p>
+            <w:r>
+              <w:t>Project AI Usage logs page</w:t>
+            </w:r>
+          </w:p>
+        </w:tc>
+        <w:tc>
+          <w:tcPr>
+            <w:tcW w:type="dxa" w:w="1560"/>
+          </w:tcPr>
+          <w:p>
+            <w:r>
+              <w:t>Project sidebar AI Usage project-level all members GET ai/usage?projectId filtered, same AiLogs</w:t>
+            </w:r>
+          </w:p>
+        </w:tc>
+        <w:tc>
+          <w:tcPr>
+            <w:tcW w:type="dxa" w:w="1560"/>
+          </w:tcPr>
+          <w:p>
+            <w:r>
+              <w:t>Project AI page</w:t>
+            </w:r>
+          </w:p>
+        </w:tc>
+        <w:tc>
+          <w:tcPr>
+            <w:tcW w:type="dxa" w:w="1560"/>
+          </w:tcPr>
+          <w:p>
+            <w:r>
+              <w:t>GET ai/usage project 200</w:t>
+            </w:r>
+          </w:p>
+        </w:tc>
+        <w:tc>
+          <w:tcPr>
+            <w:tcW w:type="dxa" w:w="1560"/>
+          </w:tcPr>
+          <w:p>
+            <w:r>
+              <w:t>1.5h</w:t>
+            </w:r>
+          </w:p>
+        </w:tc>
+      </w:tr>
+    </w:tbl>
+    <w:p/>
+    <w:p>
+      <w:r>
+        <w:t>Goal: Admin-only dashboard SuperAdmin, separate layout /admin, sidebar AI Usage/Orgs/Workspaces/Members, analytics for AI costs and org usage.</w:t>
+      </w:r>
+    </w:p>
+    <w:p/>
+    <w:p>
+      <w:r>
+        <w:t>Goal: Admin-only dashboard SuperAdmin, separate layout /admin, sidebar AI Usage/Orgs/Workspaces/Members, analytics for AI costs and org usage.</w:t>
+      </w:r>
+    </w:p>
+    <w:tbl>
+      <w:tblPr>
+        <w:tblStyle w:val="LightGrid-Accent1"/>
+        <w:tblW w:type="auto" w:w="0"/>
+        <w:tblLook w:firstColumn="1" w:firstRow="1" w:lastColumn="0" w:lastRow="0" w:noHBand="0" w:noVBand="1" w:val="04A0"/>
+      </w:tblPr>
+      <w:tblGrid>
+        <w:gridCol w:w="1560"/>
+        <w:gridCol w:w="1560"/>
+        <w:gridCol w:w="1560"/>
+        <w:gridCol w:w="1560"/>
+        <w:gridCol w:w="1560"/>
+        <w:gridCol w:w="1560"/>
+      </w:tblGrid>
+      <w:tr>
+        <w:tc>
+          <w:tcPr>
+            <w:tcW w:type="dxa" w:w="1560"/>
+          </w:tcPr>
+          <w:p>
+            <w:r>
+              <w:t>Task</w:t>
+            </w:r>
+          </w:p>
+        </w:tc>
+        <w:tc>
+          <w:tcPr>
+            <w:tcW w:type="dxa" w:w="1560"/>
+          </w:tcPr>
+          <w:p>
+            <w:r>
+              <w:t>Objective</w:t>
+            </w:r>
+          </w:p>
+        </w:tc>
+        <w:tc>
+          <w:tcPr>
+            <w:tcW w:type="dxa" w:w="1560"/>
+          </w:tcPr>
+          <w:p>
+            <w:r>
+              <w:t>Key Actions</w:t>
+            </w:r>
+          </w:p>
+        </w:tc>
+        <w:tc>
+          <w:tcPr>
+            <w:tcW w:type="dxa" w:w="1560"/>
+          </w:tcPr>
+          <w:p>
+            <w:r>
+              <w:t>Deliverables</w:t>
+            </w:r>
+          </w:p>
+        </w:tc>
+        <w:tc>
+          <w:tcPr>
+            <w:tcW w:type="dxa" w:w="1560"/>
+          </w:tcPr>
+          <w:p>
+            <w:r>
+              <w:t>Exit Criteria</w:t>
+            </w:r>
+          </w:p>
+        </w:tc>
+        <w:tc>
+          <w:tcPr>
+            <w:tcW w:type="dxa" w:w="1560"/>
+          </w:tcPr>
+          <w:p>
+            <w:r>
+              <w:t>Hours</w:t>
+            </w:r>
+          </w:p>
+        </w:tc>
+      </w:tr>
+      <w:tr>
+        <w:tc>
+          <w:tcPr>
+            <w:tcW w:type="dxa" w:w="1560"/>
+          </w:tcPr>
+          <w:p>
+            <w:r>
+              <w:t>8.1 Admin Layout + Sidebar</w:t>
+            </w:r>
+          </w:p>
+        </w:tc>
+        <w:tc>
+          <w:tcPr>
+            <w:tcW w:type="dxa" w:w="1560"/>
+          </w:tcPr>
+          <w:p>
+            <w:r>
+              <w:t>Admin layout /admin SuperAdmin only</w:t>
+            </w:r>
+          </w:p>
+        </w:tc>
+        <w:tc>
+          <w:tcPr>
+            <w:tcW w:type="dxa" w:w="1560"/>
+          </w:tcPr>
+          <w:p>
+            <w:r>
+              <w:t>Create AdminLayoutComponent sidebar Layout, adminGuard Role 0, YARP /api/admin/*, HasDefaultSchema ai</w:t>
+            </w:r>
+          </w:p>
+        </w:tc>
+        <w:tc>
+          <w:tcPr>
+            <w:tcW w:type="dxa" w:w="1560"/>
+          </w:tcPr>
+          <w:p>
+            <w:r>
+              <w:t>Admin layout, sidebar</w:t>
+            </w:r>
+          </w:p>
+        </w:tc>
+        <w:tc>
+          <w:tcPr>
+            <w:tcW w:type="dxa" w:w="1560"/>
+          </w:tcPr>
+          <w:p>
+            <w:r>
+              <w:t>GET /admin 403 Member 200 SuperAdmin</w:t>
+            </w:r>
+          </w:p>
+        </w:tc>
+        <w:tc>
+          <w:tcPr>
+            <w:tcW w:type="dxa" w:w="1560"/>
+          </w:tcPr>
+          <w:p>
+            <w:r>
+              <w:t>2h</w:t>
+            </w:r>
+          </w:p>
+        </w:tc>
+      </w:tr>
+      <w:tr>
+        <w:tc>
+          <w:tcPr>
+            <w:tcW w:type="dxa" w:w="1560"/>
+          </w:tcPr>
+          <w:p>
+            <w:r>
+              <w:t>8.2 AI Admin Analytics</w:t>
+            </w:r>
+          </w:p>
+        </w:tc>
+        <w:tc>
+          <w:tcPr>
+            <w:tcW w:type="dxa" w:w="1560"/>
+          </w:tcPr>
+          <w:p>
+            <w:r>
+              <w:t>AI usage analytics moved from 7.6</w:t>
+            </w:r>
+          </w:p>
+        </w:tc>
+        <w:tc>
+          <w:tcPr>
+            <w:tcW w:type="dxa" w:w="1560"/>
+          </w:tcPr>
+          <w:p>
+            <w:r>
+              <w:t>AiUsageLogs query GET ai/usage GROUP BY Admin page orgs using tokens cost rate limit</w:t>
+            </w:r>
+          </w:p>
+        </w:tc>
+        <w:tc>
+          <w:tcPr>
+            <w:tcW w:type="dxa" w:w="1560"/>
+          </w:tcPr>
+          <w:p>
+            <w:r>
+              <w:t>Admin AI page</w:t>
+            </w:r>
+          </w:p>
+        </w:tc>
+        <w:tc>
+          <w:tcPr>
+            <w:tcW w:type="dxa" w:w="1560"/>
+          </w:tcPr>
+          <w:p>
+            <w:r>
+              <w:t>GET ai/usage 200</w:t>
+            </w:r>
+          </w:p>
+        </w:tc>
+        <w:tc>
+          <w:tcPr>
+            <w:tcW w:type="dxa" w:w="1560"/>
+          </w:tcPr>
+          <w:p>
+            <w:r>
+              <w:t>1.5h</w:t>
+            </w:r>
+          </w:p>
+        </w:tc>
+      </w:tr>
+      <w:tr>
+        <w:tc>
+          <w:tcPr>
+            <w:tcW w:type="dxa" w:w="1560"/>
+          </w:tcPr>
+          <w:p>
+            <w:r>
+              <w:t>8.3 Admin Orgs/Workspaces</w:t>
+            </w:r>
+          </w:p>
+        </w:tc>
+        <w:tc>
+          <w:tcPr>
+            <w:tcW w:type="dxa" w:w="1560"/>
+          </w:tcPr>
+          <w:p>
+            <w:r>
+              <w:t>Admin pages Orgs/Workspaces/Members tables</w:t>
+            </w:r>
+          </w:p>
+        </w:tc>
+        <w:tc>
+          <w:tcPr>
+            <w:tcW w:type="dxa" w:w="1560"/>
+          </w:tcPr>
+          <w:p>
+            <w:r>
+              <w:t>GET admin/organizations etc SuperAdmin full access</w:t>
+            </w:r>
+          </w:p>
+        </w:tc>
+        <w:tc>
+          <w:tcPr>
+            <w:tcW w:type="dxa" w:w="1560"/>
+          </w:tcPr>
+          <w:p>
+            <w:r>
+              <w:t>Admin pages</w:t>
+            </w:r>
+          </w:p>
+        </w:tc>
+        <w:tc>
+          <w:tcPr>
+            <w:tcW w:type="dxa" w:w="1560"/>
+          </w:tcPr>
+          <w:p>
+            <w:r>
+              <w:t>GET admin/orgs 200 SuperAdmin 403 OrgAdmin</w:t>
+            </w:r>
+          </w:p>
+        </w:tc>
+        <w:tc>
+          <w:tcPr>
+            <w:tcW w:type="dxa" w:w="1560"/>
+          </w:tcPr>
+          <w:p>
+            <w:r>
+              <w:t>2h</w:t>
+            </w:r>
+          </w:p>
+        </w:tc>
+      </w:tr>
+    </w:tbl>
+    <w:p/>
     <w:sectPr>
       <w:footerReference w:type="default" r:id="rId9"/>
       <w:pgSz w:w="12240" w:h="15840"/>

</xml_diff>

<commit_message>
docs: update Tasks_Plan.docx for Phase 5 polish
</commit_message>
<xml_diff>
--- a/Documents/FlowBoard_Tasks_Plan.docx
+++ b/Documents/FlowBoard_Tasks_Plan.docx
@@ -1583,7 +1583,7 @@
           </w:tcPr>
           <w:p>
             <w:r>
-              <w:t>4: Files &amp; Charts</w:t>
+              <w:t>4: Files &amp; Charts &amp; Analytics</w:t>
             </w:r>
           </w:p>
         </w:tc>
@@ -1594,7 +1594,7 @@
           </w:tcPr>
           <w:p>
             <w:r>
-              <w:t>4.1 - 4.3 (3 tasks)</w:t>
+              <w:t>4.1 - 4.5 (5 tasks)</w:t>
             </w:r>
           </w:p>
         </w:tc>
@@ -1605,7 +1605,7 @@
           </w:tcPr>
           <w:p>
             <w:r>
-              <w:t>Cloudinary, Attachments, ApexCharts</w:t>
+              <w:t>Cloudinary, Attachments, Org/Project/Sprint Charts (ApexCharts)</w:t>
             </w:r>
           </w:p>
         </w:tc>
@@ -1616,7 +1616,7 @@
           </w:tcPr>
           <w:p>
             <w:r>
-              <w:t>7h</w:t>
+              <w:t>18h</w:t>
             </w:r>
           </w:p>
         </w:tc>
@@ -1772,7 +1772,7 @@
           </w:tcPr>
           <w:p>
             <w:r>
-              <w:t>38 Tasks</w:t>
+              <w:t>40 Tasks</w:t>
             </w:r>
           </w:p>
         </w:tc>
@@ -1790,7 +1790,7 @@
           </w:tcPr>
           <w:p>
             <w:r>
-              <w:t>~99h</w:t>
+              <w:t>~110h</w:t>
             </w:r>
           </w:p>
         </w:tc>
@@ -11801,13 +11801,7 @@
         <w:spacing w:before="144" w:after="72"/>
       </w:pPr>
       <w:r>
-        <w:rPr>
-          <w:rFonts w:ascii="Calibri" w:hAnsi="Calibri"/>
-          <w:b/>
-          <w:color w:val="1F3864"/>
-          <w:sz w:val="20"/>
-        </w:rPr>
-        <w:t>Task 4.3: Gemini 2.5 Flash AI Generate - Same Key Local/Prod (15 RPM, 1M TPM, 1500 RPD)</w:t>
+        <w:t>Task 4.3: Organization Dashboard — KPIs + Charts (Org Health, ApexCharts)</w:t>
       </w:r>
     </w:p>
     <w:tbl>
@@ -11904,17 +11898,8 @@
             <w:vAlign w:val="center"/>
           </w:tcPr>
           <w:p>
-            <w:pPr>
-              <w:jc w:val="left"/>
-            </w:pPr>
-            <w:r/>
-            <w:r>
-              <w:rPr>
-                <w:rFonts w:ascii="Calibri" w:hAnsi="Calibri"/>
-                <w:color w:val="333333"/>
-                <w:sz w:val="13"/>
-              </w:rPr>
-              <w:t>Implement AI task draft via Gemini 2.5 Flash free (same key local/prod, no fallback).</w:t>
+            <w:r>
+              <w:t>Expand Organization Overview (keep existing) with 6 KPI cards (Workspaces/Projects/Members/Issues/Active Sprints/Completed) + 5 ApexCharts: Issues by Status Donut, Issues by Priority Bar, Issues by Workspace Bar, Activity Trend Line (14d), AI Usage Line/Bar. UI placement below existing dashboard content.</w:t>
             </w:r>
           </w:p>
         </w:tc>
@@ -11947,17 +11932,8 @@
             <w:vAlign w:val="center"/>
           </w:tcPr>
           <w:p>
-            <w:pPr>
-              <w:jc w:val="left"/>
-            </w:pPr>
-            <w:r/>
-            <w:r>
-              <w:rPr>
-                <w:rFonts w:ascii="Calibri" w:hAnsi="Calibri"/>
-                <w:color w:val="333333"/>
-                <w:sz w:val="13"/>
-              </w:rPr>
-              <w:t>3h</w:t>
+            <w:r>
+              <w:t>5h</w:t>
             </w:r>
           </w:p>
         </w:tc>
@@ -11990,17 +11966,8 @@
             <w:vAlign w:val="center"/>
           </w:tcPr>
           <w:p>
-            <w:pPr>
-              <w:jc w:val="left"/>
-            </w:pPr>
-            <w:r/>
-            <w:r>
-              <w:rPr>
-                <w:rFonts w:ascii="Calibri" w:hAnsi="Calibri"/>
-                <w:color w:val="333333"/>
-                <w:sz w:val="13"/>
-              </w:rPr>
-              <w:t>Task 4.2</w:t>
+            <w:r>
+              <w:t>Task 4.2 + Phase 7 (ActivityLogs/AiUsageLogs)</w:t>
             </w:r>
           </w:p>
         </w:tc>
@@ -12264,13 +12231,7 @@
         <w:spacing w:before="144" w:after="72"/>
       </w:pPr>
       <w:r>
-        <w:rPr>
-          <w:rFonts w:ascii="Calibri" w:hAnsi="Calibri"/>
-          <w:b/>
-          <w:color w:val="1F3864"/>
-          <w:sz w:val="20"/>
-        </w:rPr>
-        <w:t>Task 4.4: Angular AI Modal + ng-apexcharts Burndown + Brevo Notifications</w:t>
+        <w:t>Task 4.4: Project Overview — KPIs + Charts (Burndown, Velocity, Status/Type/Priority/Assignee)</w:t>
       </w:r>
     </w:p>
     <w:tbl>
@@ -12367,17 +12328,8 @@
             <w:vAlign w:val="center"/>
           </w:tcPr>
           <w:p>
-            <w:pPr>
-              <w:jc w:val="left"/>
-            </w:pPr>
-            <w:r/>
-            <w:r>
-              <w:rPr>
-                <w:rFonts w:ascii="Calibri" w:hAnsi="Calibri"/>
-                <w:color w:val="333333"/>
-                <w:sz w:val="13"/>
-              </w:rPr>
-              <w:t>Build Angular AI modal (DaisyUI), apexcharts burndown, and Brevo email notifications (same key).</w:t>
+            <w:r>
+              <w:t>Enhance Project Overview (keep existing) with 5 KPI cards (Issues/Completed/In Progress/Story Points/Active Sprint) + 6 ApexCharts: Sprint Burndown Line/Area (shared), Issues by Status Donut, Issues by Type Donut/Bar, Priority Bar, Assignee Workload Bar, Sprint Velocity Bar. Reuse burndown component.</w:t>
             </w:r>
           </w:p>
         </w:tc>
@@ -12410,17 +12362,8 @@
             <w:vAlign w:val="center"/>
           </w:tcPr>
           <w:p>
-            <w:pPr>
-              <w:jc w:val="left"/>
-            </w:pPr>
-            <w:r/>
-            <w:r>
-              <w:rPr>
-                <w:rFonts w:ascii="Calibri" w:hAnsi="Calibri"/>
-                <w:color w:val="333333"/>
-                <w:sz w:val="13"/>
-              </w:rPr>
-              <w:t>2h</w:t>
+            <w:r>
+              <w:t>5h</w:t>
             </w:r>
           </w:p>
         </w:tc>
@@ -12453,16 +12396,7 @@
             <w:vAlign w:val="center"/>
           </w:tcPr>
           <w:p>
-            <w:pPr>
-              <w:jc w:val="left"/>
-            </w:pPr>
-            <w:r/>
-            <w:r>
-              <w:rPr>
-                <w:rFonts w:ascii="Calibri" w:hAnsi="Calibri"/>
-                <w:color w:val="333333"/>
-                <w:sz w:val="13"/>
-              </w:rPr>
+            <w:r>
               <w:t>Task 4.3</w:t>
             </w:r>
           </w:p>
@@ -12776,6 +12710,15 @@
         <w:spacing w:before="144" w:after="72"/>
       </w:pPr>
       <w:r>
+        <w:t>Task 4.5: Sprints Page — Detailed Sprint Analytics (Burndown Reuse)</w:t>
+      </w:r>
+    </w:p>
+    <w:p>
+      <w:pPr>
+        <w:pStyle w:val="Heading3"/>
+        <w:spacing w:before="144" w:after="72"/>
+      </w:pPr>
+      <w:r>
         <w:rPr>
           <w:rFonts w:ascii="Calibri" w:hAnsi="Calibri"/>
           <w:b/>
@@ -12785,6 +12728,218 @@
         <w:t>Task 5.1: YARP Rate Limit + Serilog + Scalar Docs (.NET 10)</w:t>
       </w:r>
     </w:p>
+    <w:tbl>
+      <w:tblPr>
+        <w:tblStyle w:val="LightGrid-Accent1"/>
+        <w:tblLayout w:type="fixed"/>
+        <w:tblLook w:firstColumn="1" w:firstRow="1" w:lastColumn="0" w:lastRow="0" w:noHBand="0" w:noVBand="1" w:val="04A0"/>
+        <w:tblW w:w="8500" w:type="dxa"/>
+        <w:tblInd w:w="300" w:type="dxa"/>
+        <w:tblCellMar>
+          <w:top w:w="60" w:type="dxa"/>
+          <w:left w:w="120" w:type="dxa"/>
+          <w:bottom w:w="60" w:type="dxa"/>
+          <w:right w:w="120" w:type="dxa"/>
+        </w:tblCellMar>
+        <w:jc w:val="center"/>
+        <w:tblCellSpacing w:w="0" w:type="dxa"/>
+      </w:tblPr>
+      <w:tblGrid>
+        <w:gridCol w:w="4250"/>
+        <w:gridCol w:w="4250"/>
+      </w:tblGrid>
+      <w:tr>
+        <w:tc>
+          <w:tcPr>
+            <w:tcW w:type="dxa" w:w="5100"/>
+            <w:vAlign w:val="center"/>
+            <w:shd w:fill="1F3864" w:val="clear"/>
+          </w:tcPr>
+          <w:p>
+            <w:pPr>
+              <w:jc w:val="center"/>
+            </w:pPr>
+            <w:r/>
+            <w:r>
+              <w:rPr>
+                <w:rFonts w:ascii="Calibri" w:hAnsi="Calibri"/>
+                <w:b/>
+                <w:color w:val="FFFFFF"/>
+                <w:sz w:val="14"/>
+              </w:rPr>
+              <w:t>Field</w:t>
+            </w:r>
+          </w:p>
+        </w:tc>
+        <w:tc>
+          <w:tcPr>
+            <w:tcW w:type="dxa" w:w="5100"/>
+            <w:vAlign w:val="center"/>
+            <w:shd w:fill="1F3864" w:val="clear"/>
+          </w:tcPr>
+          <w:p>
+            <w:pPr>
+              <w:jc w:val="center"/>
+            </w:pPr>
+            <w:r/>
+            <w:r>
+              <w:rPr>
+                <w:rFonts w:ascii="Calibri" w:hAnsi="Calibri"/>
+                <w:b/>
+                <w:color w:val="FFFFFF"/>
+                <w:sz w:val="14"/>
+              </w:rPr>
+              <w:t>Detail</w:t>
+            </w:r>
+          </w:p>
+        </w:tc>
+      </w:tr>
+      <w:tr>
+        <w:tc>
+          <w:tcPr>
+            <w:tcW w:type="dxa" w:w="1728"/>
+            <w:vAlign w:val="center"/>
+          </w:tcPr>
+          <w:p>
+            <w:pPr>
+              <w:jc w:val="left"/>
+            </w:pPr>
+            <w:r/>
+            <w:r>
+              <w:rPr>
+                <w:rFonts w:ascii="Calibri" w:hAnsi="Calibri"/>
+                <w:b/>
+                <w:color w:val="333333"/>
+                <w:sz w:val="13"/>
+              </w:rPr>
+              <w:t>Objective</w:t>
+            </w:r>
+          </w:p>
+        </w:tc>
+        <w:tc>
+          <w:tcPr>
+            <w:tcW w:type="dxa" w:w="7200"/>
+            <w:vAlign w:val="center"/>
+          </w:tcPr>
+          <w:p>
+            <w:r>
+              <w:t>Keep Sprints page content, add top section with Sprint selector + shared Burndown Area (Total vs Remaining) + statistics row [Issues] [SP] [Completed] [Remaining]. Reuse burndown component from 4.4.</w:t>
+            </w:r>
+          </w:p>
+        </w:tc>
+      </w:tr>
+      <w:tr>
+        <w:tc>
+          <w:tcPr>
+            <w:tcW w:type="dxa" w:w="1728"/>
+            <w:vAlign w:val="center"/>
+          </w:tcPr>
+          <w:p>
+            <w:pPr>
+              <w:jc w:val="left"/>
+            </w:pPr>
+            <w:r/>
+            <w:r>
+              <w:rPr>
+                <w:rFonts w:ascii="Calibri" w:hAnsi="Calibri"/>
+                <w:b/>
+                <w:color w:val="333333"/>
+                <w:sz w:val="13"/>
+              </w:rPr>
+              <w:t>Hours</w:t>
+            </w:r>
+          </w:p>
+        </w:tc>
+        <w:tc>
+          <w:tcPr>
+            <w:tcW w:type="dxa" w:w="7200"/>
+            <w:vAlign w:val="center"/>
+          </w:tcPr>
+          <w:p>
+            <w:r>
+              <w:t>3h</w:t>
+            </w:r>
+          </w:p>
+        </w:tc>
+      </w:tr>
+      <w:tr>
+        <w:tc>
+          <w:tcPr>
+            <w:tcW w:type="dxa" w:w="1728"/>
+            <w:vAlign w:val="center"/>
+          </w:tcPr>
+          <w:p>
+            <w:pPr>
+              <w:jc w:val="left"/>
+            </w:pPr>
+            <w:r/>
+            <w:r>
+              <w:rPr>
+                <w:rFonts w:ascii="Calibri" w:hAnsi="Calibri"/>
+                <w:b/>
+                <w:color w:val="333333"/>
+                <w:sz w:val="13"/>
+              </w:rPr>
+              <w:t>Dependencies</w:t>
+            </w:r>
+          </w:p>
+        </w:tc>
+        <w:tc>
+          <w:tcPr>
+            <w:tcW w:type="dxa" w:w="7200"/>
+            <w:vAlign w:val="center"/>
+          </w:tcPr>
+          <w:p>
+            <w:r>
+              <w:t>Task 4.4</w:t>
+            </w:r>
+          </w:p>
+        </w:tc>
+      </w:tr>
+      <w:tr>
+        <w:tc>
+          <w:tcPr>
+            <w:tcW w:type="dxa" w:w="1728"/>
+            <w:vAlign w:val="center"/>
+          </w:tcPr>
+          <w:p>
+            <w:pPr>
+              <w:jc w:val="left"/>
+            </w:pPr>
+            <w:r/>
+            <w:r>
+              <w:rPr>
+                <w:rFonts w:ascii="Calibri" w:hAnsi="Calibri"/>
+                <w:b/>
+                <w:color w:val="333333"/>
+                <w:sz w:val="13"/>
+              </w:rPr>
+              <w:t>Status</w:t>
+            </w:r>
+          </w:p>
+        </w:tc>
+        <w:tc>
+          <w:tcPr>
+            <w:tcW w:type="dxa" w:w="7200"/>
+            <w:vAlign w:val="center"/>
+          </w:tcPr>
+          <w:p>
+            <w:pPr>
+              <w:jc w:val="left"/>
+            </w:pPr>
+            <w:r/>
+            <w:r>
+              <w:rPr>
+                <w:rFonts w:ascii="Calibri" w:hAnsi="Calibri"/>
+                <w:color w:val="333333"/>
+                <w:sz w:val="13"/>
+              </w:rPr>
+              <w:t>Pending</w:t>
+            </w:r>
+          </w:p>
+        </w:tc>
+      </w:tr>
+    </w:tbl>
     <w:tbl>
       <w:tblPr>
         <w:tblStyle w:val="LightGrid-Accent1"/>

</xml_diff>